<commit_message>
Report: restore four framing lines to the discussion section
Cutting the document 38% took four sentences out of the discussion that were
carrying weight rather than padding:

- 'This is the central open question, and the data does not settle it' - tells the
  reader 7.1 is the one to engage with
- 'We would like a view on whether the direction is worth completing at all' -
  states what is actually being asked
- 'The risk is missing backdoors, not inventing them' - the one-line summary of
  why generator-blindness and oracle-blindness are different exposures
- 'We deliberately left the prompt untouched, so it stays comparable to the
  published baseline' - provenance for why a known defect was carried

All nine questions and every substantive figure had survived the cut; these are
the connective sentences that made them land. Discussion now 628 words, report
2,585.
</commit_message>
<xml_diff>
--- a/reports/2026-08-10-B1-factorial-report.docx
+++ b/reports/2026-08-10-B1-factorial-report.docx
@@ -2850,6 +2850,18 @@
     </w:p>
     <w:p>
       <w:pPr>
+        <w:pStyle w:val="FirstParagraph"/>
+      </w:pPr>
+      <w:r>
+        <w:rPr>
+          <w:b/>
+          <w:bCs/>
+        </w:rPr>
+        <w:t xml:space="preserve">This is the central open question, and the data does not settle it.</w:t>
+      </w:r>
+    </w:p>
+    <w:p>
+      <w:pPr>
         <w:pStyle w:val="Compact"/>
         <w:numPr>
           <w:ilvl w:val="0"/>
@@ -2989,6 +3001,16 @@
       <w:r>
         <w:t xml:space="preserve">Some runs have begun but are excluded — they are not powered to the same standard, and a partial result should not sit beside a complete one.</w:t>
       </w:r>
+      <w:r>
+        <w:t xml:space="preserve"> </w:t>
+      </w:r>
+      <w:r>
+        <w:rPr>
+          <w:b/>
+          <w:bCs/>
+        </w:rPr>
+        <w:t xml:space="preserve">We would like a view on whether the direction is worth completing at all.</w:t>
+      </w:r>
     </w:p>
     <w:p>
       <w:pPr>
@@ -3186,7 +3208,17 @@
         <w:t xml:space="preserve"> </w:t>
       </w:r>
       <w:r>
-        <w:t xml:space="preserve">would read the code; the tests themselves still would not. So this cannot manufacture a false accusation — only miss real ones. The best-case arm’s false-alarm rate was exactly zero in the earlier study</w:t>
+        <w:t xml:space="preserve">would read the code; the tests themselves still would not. So this cannot manufacture a false accusation — only miss real ones. The best-case arm’s false-alarm rate was exactly zero in the earlier study.</w:t>
+      </w:r>
+      <w:r>
+        <w:t xml:space="preserve"> </w:t>
+      </w:r>
+      <w:r>
+        <w:rPr>
+          <w:b/>
+          <w:bCs/>
+        </w:rPr>
+        <w:t xml:space="preserve">The risk is missing backdoors, not inventing them</w:t>
       </w:r>
     </w:p>
     <w:p>
@@ -3391,7 +3423,7 @@
         <w:t xml:space="preserve"> </w:t>
       </w:r>
       <w:r>
-        <w:t xml:space="preserve">at level 9. Those 11 stop us lowering the threshold: at 10 we catch 21/65 for 2% false alarms; at 9 we catch 58/65 but at 24%, unaffordable. A finer scale at the top may beat either intervention tested here</w:t>
+        <w:t xml:space="preserve">at level 9. Those 11 stop us lowering the threshold: at 10 we catch 21/65 for 2% false alarms; at 9 we catch 58/65 but at 24%, unaffordable. A finer scale at the top may beat either intervention tested here. We deliberately left the prompt untouched for this experiment, so it stays comparable to the published baseline</w:t>
       </w:r>
     </w:p>
     <w:p>

</xml_diff>